<commit_message>
Foca módulo do site no portal do aluno e adiciona MS Graph/Teams
Site institucional nunca foi ao ar em produção — módulo passa a
descrever só o portal do aluno, que de fato consome o SophiA ao
vivo. Adiciona card de Microsoft 365/Teams (desenvolvido no
ipessp-core), mesmo padrão do CRM/Comercial.

Co-Authored-By: Claude Sonnet 5 <noreply@anthropic.com>
</commit_message>
<xml_diff>
--- a/DOCUMENTACAO.docx
+++ b/DOCUMENTACAO.docx
@@ -729,48 +729,12 @@
         <w:pStyle w:val="Heading3"/>
       </w:pPr>
       <w:r>
-        <w:t>Site Institucional  —  Portal</w:t>
+        <w:t>Portal do Aluno</w:t>
       </w:r>
     </w:p>
     <w:p>
       <w:r>
-        <w:t>Site público em Next.js com as páginas institucionais do IPESSP (cursos, graduação, pós-graduação, corpo docente, clínica-escola, laboratórios, biblioteca virtual, revista científica, polo São José dos Campos, entre outras).</w:t>
-      </w:r>
-    </w:p>
-    <w:p>
-      <w:pPr>
-        <w:pStyle w:val="ListBullet"/>
-        <w:spacing w:after="60"/>
-      </w:pPr>
-      <w:r>
-        <w:t>Pré-matrícula</w:t>
-      </w:r>
-    </w:p>
-    <w:p>
-      <w:pPr>
-        <w:pStyle w:val="ListBullet"/>
-        <w:spacing w:after="60"/>
-      </w:pPr>
-      <w:r>
-        <w:t>Fale conosco &amp; ouvidoria</w:t>
-      </w:r>
-    </w:p>
-    <w:p>
-      <w:pPr>
-        <w:pStyle w:val="ListBullet"/>
-        <w:spacing w:after="60"/>
-      </w:pPr>
-      <w:r>
-        <w:t>Solicitação de eventos</w:t>
-      </w:r>
-    </w:p>
-    <w:p>
-      <w:pPr>
-        <w:pStyle w:val="ListBullet"/>
-        <w:spacing w:after="60"/>
-      </w:pPr>
-      <w:r>
-        <w:t>Candidaturas (trabalhe conosco, com upload de currículo)</w:t>
+        <w:t>O site institucional (Next.js, ver Infraestrutura) não é o que está em produção hoje — mas o portal do aluno dentro dele é a parte funcionalmente relevante: login próprio, financeiro, curso, notas, frequência, horário e documentos.</w:t>
       </w:r>
     </w:p>
     <w:p>
@@ -782,10 +746,25 @@
         <w:rPr>
           <w:b/>
         </w:rPr>
-        <w:t xml:space="preserve">Portal do aluno </w:t>
+        <w:t xml:space="preserve">Consulta ao vivo: </w:t>
       </w:r>
       <w:r>
-        <w:t>com login próprio (financeiro, curso, notas, frequência, horário e documentos) — como o chatbot, consome as rotas do SophiA ao vivo a cada acesso; o envio de documentos registra o arquivo no cadastro do cliente na SophiA</w:t>
+        <w:t>como o chatbot, consome as rotas do SophiA a cada acesso — notas, frequência, horário e dados da matrícula</w:t>
+      </w:r>
+    </w:p>
+    <w:p>
+      <w:pPr>
+        <w:pStyle w:val="ListBullet"/>
+        <w:spacing w:after="60"/>
+      </w:pPr>
+      <w:r>
+        <w:rPr>
+          <w:b/>
+        </w:rPr>
+        <w:t xml:space="preserve">Documentos: </w:t>
+      </w:r>
+      <w:r>
+        <w:t>sobe o arquivo pro storage e registra no cadastro do cliente na SophiA</w:t>
       </w:r>
     </w:p>
     <w:p>
@@ -1030,6 +1009,46 @@
       </w:pPr>
       <w:r>
         <w:t>Relatório em PDF por e-mail</w:t>
+      </w:r>
+    </w:p>
+    <w:p>
+      <w:pPr>
+        <w:pStyle w:val="Heading3"/>
+      </w:pPr>
+      <w:r>
+        <w:t>Microsoft 365 / Teams — desenvolvido no ipessp-core</w:t>
+      </w:r>
+    </w:p>
+    <w:p>
+      <w:r>
+        <w:t>Também fora do código deste projeto. Ponto único de integração com o Microsoft Graph (client-credentials, Azure AD).</w:t>
+      </w:r>
+    </w:p>
+    <w:p>
+      <w:pPr>
+        <w:pStyle w:val="ListBullet"/>
+        <w:spacing w:after="60"/>
+      </w:pPr>
+      <w:r>
+        <w:t>Agendamento automático de aulas/reuniões no Teams, vinculado às turmas</w:t>
+      </w:r>
+    </w:p>
+    <w:p>
+      <w:pPr>
+        <w:pStyle w:val="ListBullet"/>
+        <w:spacing w:after="60"/>
+      </w:pPr>
+      <w:r>
+        <w:t>Gestão de usuários e grupos do Microsoft 365, consulta de sign-ins</w:t>
+      </w:r>
+    </w:p>
+    <w:p>
+      <w:pPr>
+        <w:pStyle w:val="ListBullet"/>
+        <w:spacing w:after="60"/>
+      </w:pPr>
+      <w:r>
+        <w:t>Sync da planilha comercial via SharePoint (mesma integração Graph — ver módulo Comercial)</w:t>
       </w:r>
     </w:p>
     <w:p>

</xml_diff>